<commit_message>
Report: Sadaf's Task 3 failure analysis and audit results, longer-run note, audit kappa computed from sheets when present; README members line restored
</commit_message>
<xml_diff>
--- a/report/DATA266_Lab1_Report_Team_16.docx
+++ b/report/DATA266_Lab1_Report_Team_16.docx
@@ -17,7 +17,7 @@
     </w:p>
     <w:p>
       <w:r>
-        <w:t>Poushali Purkayastha and Sadaf Fatima Syeda. Fall 2026. Report date 2026-09-28.</w:t>
+        <w:t>Poushali Purkayastha and Sadaf Fatima Syeda. Fall 2026. Report date 2026-10-06.</w:t>
       </w:r>
     </w:p>
     <w:p>
@@ -1171,7 +1171,7 @@
           <w:noProof/>
         </w:rPr>
         <w:drawing>
-          <wp:inline distT="0" distB="0" distL="0" distR="0" wp14:anchorId="406D3145" wp14:editId="38080001">
+          <wp:inline distT="0" distB="0" distL="0" distR="0" wp14:anchorId="284F98A8" wp14:editId="10A03F53">
             <wp:extent cx="5486400" cy="1828800"/>
             <wp:effectExtent l="0" t="0" r="0" b="0"/>
             <wp:docPr id="1" name="Picture 1"/>
@@ -1223,7 +1223,7 @@
         </w:rPr>
         <w:lastRenderedPageBreak/>
         <w:drawing>
-          <wp:inline distT="0" distB="0" distL="0" distR="0" wp14:anchorId="25F4FB55" wp14:editId="425AC4F8">
+          <wp:inline distT="0" distB="0" distL="0" distR="0" wp14:anchorId="6EAA01E8" wp14:editId="0B180850">
             <wp:extent cx="5486400" cy="3712323"/>
             <wp:effectExtent l="0" t="0" r="0" b="0"/>
             <wp:docPr id="2" name="Picture 2"/>
@@ -5374,7 +5374,7 @@
         </w:rPr>
         <w:lastRenderedPageBreak/>
         <w:drawing>
-          <wp:inline distT="0" distB="0" distL="0" distR="0" wp14:anchorId="2F4336CF" wp14:editId="409A7F70">
+          <wp:inline distT="0" distB="0" distL="0" distR="0" wp14:anchorId="34038F40" wp14:editId="079B47D8">
             <wp:extent cx="2926080" cy="2600960"/>
             <wp:effectExtent l="0" t="0" r="0" b="0"/>
             <wp:docPr id="3" name="Picture 3"/>
@@ -5425,7 +5425,7 @@
           <w:noProof/>
         </w:rPr>
         <w:drawing>
-          <wp:inline distT="0" distB="0" distL="0" distR="0" wp14:anchorId="0217B62C" wp14:editId="62B4583A">
+          <wp:inline distT="0" distB="0" distL="0" distR="0" wp14:anchorId="6B1FE8C8" wp14:editId="42322D27">
             <wp:extent cx="5486400" cy="1565618"/>
             <wp:effectExtent l="0" t="0" r="0" b="0"/>
             <wp:docPr id="4" name="Picture 4"/>
@@ -10030,7 +10030,7 @@
               <w:rPr>
                 <w:sz w:val="16"/>
               </w:rPr>
-              <w:t>G max inf, D max inf (fp16 overflow readings); non-finite steps 0</w:t>
+              <w:t>G max inf (fp16 overflow steps skipped by GradScaler; losses stayed finite), D max inf (fp16 overflow steps skipped by GradScaler; losses stayed finite) (fp16 overflow readings); non-finite steps 0</w:t>
             </w:r>
           </w:p>
         </w:tc>
@@ -10127,7 +10127,7 @@
               <w:rPr>
                 <w:sz w:val="16"/>
               </w:rPr>
-              <w:t>Human audit</w:t>
+              <w:t>Longer-run check</w:t>
             </w:r>
           </w:p>
         </w:tc>
@@ -10140,7 +10140,7 @@
               <w:rPr>
                 <w:sz w:val="16"/>
               </w:rPr>
-              <w:t>pending: blinded 30-photo set built with src/audit.py, both raters to score style, content, artifacts</w:t>
+              <w:t>not run; the 24-epoch run is the only full run</w:t>
             </w:r>
           </w:p>
         </w:tc>
@@ -10153,7 +10153,48 @@
               <w:rPr>
                 <w:sz w:val="16"/>
               </w:rPr>
-              <w:t>pending: blinded set in outputs/audit with sheets for both raters</w:t>
+              <w:t>80,000 steps on an RTX 4090 scored 68.30 against 66.90, so the 20,000-step run was kept</w:t>
+            </w:r>
+          </w:p>
+        </w:tc>
+      </w:tr>
+      <w:tr>
+        <w:tc>
+          <w:tcPr>
+            <w:tcW w:w="2448" w:type="dxa"/>
+          </w:tcPr>
+          <w:p>
+            <w:r>
+              <w:rPr>
+                <w:sz w:val="16"/>
+              </w:rPr>
+              <w:t>Human audit, photo to Monet, 30 blinded samples</w:t>
+            </w:r>
+          </w:p>
+        </w:tc>
+        <w:tc>
+          <w:tcPr>
+            <w:tcW w:w="3672" w:type="dxa"/>
+          </w:tcPr>
+          <w:p>
+            <w:r>
+              <w:rPr>
+                <w:sz w:val="16"/>
+              </w:rPr>
+              <w:t>pending: blinded set built with src/audit.py; sheets not yet in the repo</w:t>
+            </w:r>
+          </w:p>
+        </w:tc>
+        <w:tc>
+          <w:tcPr>
+            <w:tcW w:w="3672" w:type="dxa"/>
+          </w:tcPr>
+          <w:p>
+            <w:r>
+              <w:rPr>
+                <w:sz w:val="16"/>
+              </w:rPr>
+              <w:t>style 3.40, content 3.10, artifacts 2.80 (1 to 5, n = 30); one rater so far (Sadaf)</w:t>
             </w:r>
           </w:p>
         </w:tc>
@@ -10207,7 +10248,7 @@
           <w:noProof/>
         </w:rPr>
         <w:drawing>
-          <wp:inline distT="0" distB="0" distL="0" distR="0" wp14:anchorId="3BA98349" wp14:editId="711E6CAC">
+          <wp:inline distT="0" distB="0" distL="0" distR="0" wp14:anchorId="19FB0B9C" wp14:editId="4EF91C5D">
             <wp:extent cx="5852160" cy="1376979"/>
             <wp:effectExtent l="0" t="0" r="0" b="0"/>
             <wp:docPr id="5" name="Picture 5"/>
@@ -10259,7 +10300,7 @@
         </w:rPr>
         <w:lastRenderedPageBreak/>
         <w:drawing>
-          <wp:inline distT="0" distB="0" distL="0" distR="0" wp14:anchorId="373BE491" wp14:editId="0FBC5FAD">
+          <wp:inline distT="0" distB="0" distL="0" distR="0" wp14:anchorId="45C1FA92" wp14:editId="3DB68443">
             <wp:extent cx="3108960" cy="4663440"/>
             <wp:effectExtent l="0" t="0" r="0" b="0"/>
             <wp:docPr id="6" name="Picture 6"/>
@@ -10310,7 +10351,7 @@
           <w:noProof/>
         </w:rPr>
         <w:drawing>
-          <wp:inline distT="0" distB="0" distL="0" distR="0" wp14:anchorId="48AF30E3" wp14:editId="03F3416C">
+          <wp:inline distT="0" distB="0" distL="0" distR="0" wp14:anchorId="1DFCD449" wp14:editId="0768B51D">
             <wp:extent cx="5486400" cy="2562056"/>
             <wp:effectExtent l="0" t="0" r="0" b="0"/>
             <wp:docPr id="7" name="Picture 7"/>
@@ -10362,7 +10403,7 @@
         </w:rPr>
         <w:lastRenderedPageBreak/>
         <w:drawing>
-          <wp:inline distT="0" distB="0" distL="0" distR="0" wp14:anchorId="26216E41" wp14:editId="6B8F78EB">
+          <wp:inline distT="0" distB="0" distL="0" distR="0" wp14:anchorId="56F8BCAD" wp14:editId="1F6B19F5">
             <wp:extent cx="4572000" cy="2288213"/>
             <wp:effectExtent l="0" t="0" r="0" b="0"/>
             <wp:docPr id="8" name="Picture 8"/>
@@ -10420,7 +10461,7 @@
         <w:t>Both members submitted under PairProgramming_Team_16 in the required format, a submission.csv with ID, FID, and MiFID. Poushali's submission scored 48.85532 and Sadaf's 66.90192; lower is better, and the score is the average of FID and MiFID as defined on the competition's Overview page. Poushali's numbers were computed by src/kaggle_eval.py on all 7,038 generated images against the competition's real_stats.npz, whose stored features match ours with cosine 0.9999, so they follow the course definitions exact</w:t>
       </w:r>
       <w:r>
-        <w:t>ly. On 2026-09-28 the team's best submission ranked first on the public leaderboard. The private score and the final rank will be recorded in each member's kaggle_results.json and metrics report when the competition closes. Every submitted image is the unedited output of the member's own generator; the full image sets are archived on Google Drive.</w:t>
+        <w:t>ly. On 2026-09-28 the team's best submission ranked first on the public leaderboard. The competition closes on 2026-10-06; the private score and the final rank are recorded in each member's kaggle_results.json and metrics report once Kaggle publishes them. Every submitted image is the unedited output of the member's own generator; the full image sets are archived on Google Drive.</w:t>
       </w:r>
     </w:p>
     <w:p>
@@ -10444,20 +10485,23 @@
         <w:t>Weaknesses. Poushali's model shows a checkerboard texture in its 256 px outputs, a consequence of transposed-convolution upsampling in a generator trained at 128 px, and it translates Monet to photo weakly (LPIPS 0.24, coverage 0.15), which the identity loss and the 270-image Monet domain explain. Sadaf's model changes its inputs more (LPIPS 0.54 to 0.56 against 0.24 to 0.36) at the cost of realism as measured by FID, and without an identity term its untrained identity L1 is high (0.33 to 0.43), meaning the</w:t>
       </w:r>
       <w:r>
-        <w:t xml:space="preserve"> generators recolour images that already belong to the target domain. Her discriminator losses stayed near 0.5 throughout, the balanced regime of BCE training, while Poushali's Monet discriminator pulled ahead during learning-rate decay.</w:t>
+        <w:t xml:space="preserve"> generators recolour images that already belong to the target domain. Her discriminator losses stayed near 0.5 throughout, the balanced regime of BCE training, while Poushali's Monet discriminator pulled ahead during learning-rate decay. Her 80,000-step rerun is a useful negative result: four times longer training made the score worse (68.30 against 66.90), the discriminator loss fell to about 0.3, and the outputs turned grainy, so for this data size the discriminator, not the step count, is the limiting fa</w:t>
+      </w:r>
+      <w:r>
+        <w:t>ctor.</w:t>
       </w:r>
     </w:p>
     <w:p>
       <w:r>
-        <w:t>Limitations. FID against only 300 real Monets is noisy and upward-biased for every team, so absolute values should not be compared with published numbers; KID and the manifold metrics are reported for that reason. The two members' competition scores are not computed on identical image sets (all 7,038 photos against a 300-image holdout, and one direction against the mean of both), so the leaderboard, which scores the same way for everyone, is the fair comparison. The human audit had not been scored when this</w:t>
+        <w:t xml:space="preserve">Limitations. FID against only 300 real Monets is noisy and upward-biased for every team, so absolute values should not be compared with published numbers; KID and the manifold metrics are reported for that reason. The two members' competition scores are not computed on identical image sets (all 7,038 photos against a 300-image holdout, and one direction against the mean of both), so the leaderboard, which scores the same way for everyone, is the fair comparison. </w:t>
       </w:r>
       <w:r>
-        <w:t xml:space="preserve"> report was written, so image quality is judged here only through Inception features and the sample grids.</w:t>
+        <w:lastRenderedPageBreak/>
+        <w:t>The human audit had not been scored when this report was written, so image quality is judged here only through Inception features and the sample grids.</w:t>
       </w:r>
     </w:p>
     <w:p>
       <w:r>
-        <w:lastRenderedPageBreak/>
         <w:t>What the team would try next. Combine the two designs: the ResNet generator with least-squares loss at 256 px training, with identity loss only on the photo-to-Monet generator; replace transposed convolutions with upsample-and-convolution to remove the checkerboard; halve the discriminator learning rate and train for 60 or more epochs, which the lab benchmark shows is affordable; and finish the blinded audit so a human judgment sits beside the automated metrics.</w:t>
       </w:r>
     </w:p>
@@ -10719,7 +10763,7 @@
           <w:noProof/>
         </w:rPr>
         <w:drawing>
-          <wp:inline distT="0" distB="0" distL="0" distR="0" wp14:anchorId="7A1ED03F" wp14:editId="0B27EAEA">
+          <wp:inline distT="0" distB="0" distL="0" distR="0" wp14:anchorId="6ACF8F10" wp14:editId="37B04875">
             <wp:extent cx="2194560" cy="2194560"/>
             <wp:effectExtent l="0" t="0" r="0" b="0"/>
             <wp:docPr id="9" name="Picture 9"/>
@@ -10771,7 +10815,7 @@
         </w:rPr>
         <w:lastRenderedPageBreak/>
         <w:drawing>
-          <wp:inline distT="0" distB="0" distL="0" distR="0" wp14:anchorId="156BC763" wp14:editId="62CCD32A">
+          <wp:inline distT="0" distB="0" distL="0" distR="0" wp14:anchorId="00D87CDC" wp14:editId="0C3ABAEC">
             <wp:extent cx="2194560" cy="2194560"/>
             <wp:effectExtent l="0" t="0" r="0" b="0"/>
             <wp:docPr id="10" name="Picture 10"/>
@@ -10818,7 +10862,354 @@
     </w:p>
     <w:p>
       <w:r>
-        <w:t>Sadaf Fatima Syeda: her Task 3 failure analysis is to be added to task3_gan/Sadaf_Fatima_Syeda/failure_analysis.md and to this section before the final push. Her sample grid (outputs/final_grid.png) and loss curves are included above, and her metrics record no non-finite steps and discriminator losses of about 0.5 in the last 20% of training.</w:t>
+        <w:t>Sadaf Fatima Syeda, from task3_gan/Sadaf_Fatima_Syeda/failure_analysis.md. Rows and columns refer to outputs/final_grid.png (row 2 photo to Monet, row 4 Monet to photo).</w:t>
+      </w:r>
+    </w:p>
+    <w:tbl>
+      <w:tblPr>
+        <w:tblStyle w:val="TableGrid"/>
+        <w:tblW w:w="0" w:type="auto"/>
+        <w:tblLook w:val="04A0" w:firstRow="1" w:lastRow="0" w:firstColumn="1" w:lastColumn="0" w:noHBand="0" w:noVBand="1"/>
+      </w:tblPr>
+      <w:tblGrid>
+        <w:gridCol w:w="576"/>
+        <w:gridCol w:w="2448"/>
+        <w:gridCol w:w="1872"/>
+        <w:gridCol w:w="5040"/>
+      </w:tblGrid>
+      <w:tr>
+        <w:tc>
+          <w:tcPr>
+            <w:tcW w:w="576" w:type="dxa"/>
+          </w:tcPr>
+          <w:p>
+            <w:r>
+              <w:rPr>
+                <w:b/>
+                <w:sz w:val="16"/>
+              </w:rPr>
+              <w:t>Case</w:t>
+            </w:r>
+          </w:p>
+        </w:tc>
+        <w:tc>
+          <w:tcPr>
+            <w:tcW w:w="2448" w:type="dxa"/>
+          </w:tcPr>
+          <w:p>
+            <w:r>
+              <w:rPr>
+                <w:b/>
+                <w:sz w:val="16"/>
+              </w:rPr>
+              <w:t>Where to look</w:t>
+            </w:r>
+          </w:p>
+        </w:tc>
+        <w:tc>
+          <w:tcPr>
+            <w:tcW w:w="1872" w:type="dxa"/>
+          </w:tcPr>
+          <w:p>
+            <w:r>
+              <w:rPr>
+                <w:b/>
+                <w:sz w:val="16"/>
+              </w:rPr>
+              <w:t>Failure type</w:t>
+            </w:r>
+          </w:p>
+        </w:tc>
+        <w:tc>
+          <w:tcPr>
+            <w:tcW w:w="5040" w:type="dxa"/>
+          </w:tcPr>
+          <w:p>
+            <w:r>
+              <w:rPr>
+                <w:b/>
+                <w:sz w:val="16"/>
+              </w:rPr>
+              <w:t>Observation and fix</w:t>
+            </w:r>
+          </w:p>
+        </w:tc>
+      </w:tr>
+      <w:tr>
+        <w:tc>
+          <w:tcPr>
+            <w:tcW w:w="576" w:type="dxa"/>
+          </w:tcPr>
+          <w:p>
+            <w:r>
+              <w:rPr>
+                <w:sz w:val="16"/>
+              </w:rPr>
+              <w:t>1</w:t>
+            </w:r>
+          </w:p>
+        </w:tc>
+        <w:tc>
+          <w:tcPr>
+            <w:tcW w:w="2448" w:type="dxa"/>
+          </w:tcPr>
+          <w:p>
+            <w:r>
+              <w:rPr>
+                <w:sz w:val="16"/>
+              </w:rPr>
+              <w:t>final grid row 2, columns 2, 4, 5, 6</w:t>
+            </w:r>
+          </w:p>
+        </w:tc>
+        <w:tc>
+          <w:tcPr>
+            <w:tcW w:w="1872" w:type="dxa"/>
+          </w:tcPr>
+          <w:p>
+            <w:r>
+              <w:rPr>
+                <w:sz w:val="16"/>
+              </w:rPr>
+              <w:t>repeated stamp texture</w:t>
+            </w:r>
+          </w:p>
+        </w:tc>
+        <w:tc>
+          <w:tcPr>
+            <w:tcW w:w="5040" w:type="dxa"/>
+          </w:tcPr>
+          <w:p>
+            <w:r>
+              <w:rPr>
+                <w:sz w:val="16"/>
+              </w:rPr>
+              <w:t>A small flower-like pattern repeats across flat sky areas in unrelated images; the 2-layer PatchGAN only sees 34x34 patches and cannot detect the repetition, which matches the low photo-to-Monet precision of 0.27. Fix: identity loss and upsample-and-convolution in the decoder.</w:t>
+            </w:r>
+          </w:p>
+        </w:tc>
+      </w:tr>
+      <w:tr>
+        <w:tc>
+          <w:tcPr>
+            <w:tcW w:w="576" w:type="dxa"/>
+          </w:tcPr>
+          <w:p>
+            <w:r>
+              <w:rPr>
+                <w:sz w:val="16"/>
+              </w:rPr>
+              <w:t>2</w:t>
+            </w:r>
+          </w:p>
+        </w:tc>
+        <w:tc>
+          <w:tcPr>
+            <w:tcW w:w="2448" w:type="dxa"/>
+          </w:tcPr>
+          <w:p>
+            <w:r>
+              <w:rPr>
+                <w:sz w:val="16"/>
+              </w:rPr>
+              <w:t>final grid row 4, columns 3, 4</w:t>
+            </w:r>
+          </w:p>
+        </w:tc>
+        <w:tc>
+          <w:tcPr>
+            <w:tcW w:w="1872" w:type="dxa"/>
+          </w:tcPr>
+          <w:p>
+            <w:r>
+              <w:rPr>
+                <w:sz w:val="16"/>
+              </w:rPr>
+              <w:t>dark, blurry photos</w:t>
+            </w:r>
+          </w:p>
+        </w:tc>
+        <w:tc>
+          <w:tcPr>
+            <w:tcW w:w="5040" w:type="dxa"/>
+          </w:tcPr>
+          <w:p>
+            <w:r>
+              <w:rPr>
+                <w:sz w:val="16"/>
+              </w:rPr>
+              <w:t>Monet-to-photo outputs lose detail and turn dark; the model must invent detail from only 300 paintings, which matches FID 143 and recall 0.26 in that direction. Fix: more Monet-side augmentation and least-squares loss.</w:t>
+            </w:r>
+          </w:p>
+        </w:tc>
+      </w:tr>
+      <w:tr>
+        <w:tc>
+          <w:tcPr>
+            <w:tcW w:w="576" w:type="dxa"/>
+          </w:tcPr>
+          <w:p>
+            <w:r>
+              <w:rPr>
+                <w:sz w:val="16"/>
+              </w:rPr>
+              <w:t>3</w:t>
+            </w:r>
+          </w:p>
+        </w:tc>
+        <w:tc>
+          <w:tcPr>
+            <w:tcW w:w="2448" w:type="dxa"/>
+          </w:tcPr>
+          <w:p>
+            <w:r>
+              <w:rPr>
+                <w:sz w:val="16"/>
+              </w:rPr>
+              <w:t>final grid row 4 column 2, row 2 column 3</w:t>
+            </w:r>
+          </w:p>
+        </w:tc>
+        <w:tc>
+          <w:tcPr>
+            <w:tcW w:w="1872" w:type="dxa"/>
+          </w:tcPr>
+          <w:p>
+            <w:r>
+              <w:rPr>
+                <w:sz w:val="16"/>
+              </w:rPr>
+              <w:t>white smears and ghost shapes</w:t>
+            </w:r>
+          </w:p>
+        </w:tc>
+        <w:tc>
+          <w:tcPr>
+            <w:tcW w:w="5040" w:type="dxa"/>
+          </w:tcPr>
+          <w:p>
+            <w:r>
+              <w:rPr>
+                <w:sz w:val="16"/>
+              </w:rPr>
+              <w:t>Bright edges pass straight through the U-Net skip connections while the colours change, leaving white outlines. Fix: a ResNet generator without long skips.</w:t>
+            </w:r>
+          </w:p>
+        </w:tc>
+      </w:tr>
+      <w:tr>
+        <w:tc>
+          <w:tcPr>
+            <w:tcW w:w="576" w:type="dxa"/>
+          </w:tcPr>
+          <w:p>
+            <w:r>
+              <w:rPr>
+                <w:sz w:val="16"/>
+              </w:rPr>
+              <w:t>4</w:t>
+            </w:r>
+          </w:p>
+        </w:tc>
+        <w:tc>
+          <w:tcPr>
+            <w:tcW w:w="2448" w:type="dxa"/>
+          </w:tcPr>
+          <w:p>
+            <w:r>
+              <w:rPr>
+                <w:sz w:val="16"/>
+              </w:rPr>
+              <w:t>outputs/long_run_80k</w:t>
+            </w:r>
+          </w:p>
+        </w:tc>
+        <w:tc>
+          <w:tcPr>
+            <w:tcW w:w="1872" w:type="dxa"/>
+          </w:tcPr>
+          <w:p>
+            <w:r>
+              <w:rPr>
+                <w:sz w:val="16"/>
+              </w:rPr>
+              <w:t>longer training made it worse</w:t>
+            </w:r>
+          </w:p>
+        </w:tc>
+        <w:tc>
+          <w:tcPr>
+            <w:tcW w:w="5040" w:type="dxa"/>
+          </w:tcPr>
+          <w:p>
+            <w:r>
+              <w:rPr>
+                <w:sz w:val="16"/>
+              </w:rPr>
+              <w:t>An 80,000-step run on an RTX 4090 scored 68.30 against 66.90 (FID 127.0 and 145.4 against 123.3 and 143.5); the discriminator loss fell to about 0.3 and outputs became grainy. Fix: select the checkpoint by FID and slow the discriminator.</w:t>
+            </w:r>
+          </w:p>
+        </w:tc>
+      </w:tr>
+      <w:tr>
+        <w:tc>
+          <w:tcPr>
+            <w:tcW w:w="576" w:type="dxa"/>
+          </w:tcPr>
+          <w:p>
+            <w:r>
+              <w:rPr>
+                <w:sz w:val="16"/>
+              </w:rPr>
+              <w:t>5</w:t>
+            </w:r>
+          </w:p>
+        </w:tc>
+        <w:tc>
+          <w:tcPr>
+            <w:tcW w:w="2448" w:type="dxa"/>
+          </w:tcPr>
+          <w:p>
+            <w:r>
+              <w:rPr>
+                <w:sz w:val="16"/>
+              </w:rPr>
+              <w:t>final grid row 2, columns 1, 7</w:t>
+            </w:r>
+          </w:p>
+        </w:tc>
+        <w:tc>
+          <w:tcPr>
+            <w:tcW w:w="1872" w:type="dxa"/>
+          </w:tcPr>
+          <w:p>
+            <w:r>
+              <w:rPr>
+                <w:sz w:val="16"/>
+              </w:rPr>
+              <w:t>weak style in busy scenes</w:t>
+            </w:r>
+          </w:p>
+        </w:tc>
+        <w:tc>
+          <w:tcPr>
+            <w:tcW w:w="5040" w:type="dxa"/>
+          </w:tcPr>
+          <w:p>
+            <w:r>
+              <w:rPr>
+                <w:sz w:val="16"/>
+              </w:rPr>
+              <w:t>Colours move to Monet's palette but busy scenes look like a filtered photo; cycle weight 8 keeps a lot of detail (content cosine 0.66). Fix: try a lower cycle weight.</w:t>
+            </w:r>
+          </w:p>
+        </w:tc>
+      </w:tr>
+    </w:tbl>
+    <w:p/>
+    <w:p>
+      <w:r>
+        <w:t>Training stability: no NaN or Inf losses in 20,000 steps; discriminator losses stayed near 0.5 in the last 20% of training; the recorded maximum gradient norms read inf because fp16 overflow steps were skipped by the gradient scaler while the losses stayed finite.</w:t>
       </w:r>
     </w:p>
     <w:p>
@@ -10831,10 +11222,21 @@
     </w:p>
     <w:p>
       <w:r>
-        <w:t>Protocol: 30 fixed holdout photos are translated by each member's generator, the outputs are shuffled and renamed so raters cannot tell which model produced them, and both members score every output from 1 to 5 on style (how Monet-like), content (how well the scene is kept), and artifacts (5 means none). Agreement is reported as Cohen's kappa, linear-weighted kappa, and percent agreement per criterion. Both members have built their blinded sets (task3_gan/Poushali_Purkayastha/src/audit.py and task3_gan/Sada</w:t>
+        <w:t>Protocol: 30 fixed holdout photos are translated by a member's generator, the outputs are shuffled and renamed so raters cannot tell which image is which, and both members score every output from 1 to 5 on style (how Monet-like), content (how well the scene is kept), and artifacts (5 means none). Agreement is reported as Cohen's kappa and percent agreement per criterion. Each member has a blinded set of 30 photo-to-Monet samples: Sadaf's in task3_gan/Sadaf_Fatima_Syeda/outputs/audit (sheet_rater1_Sadaf.csv,</w:t>
       </w:r>
       <w:r>
-        <w:t>f_Fatima_Syeda/outputs/audit). The ratings and agreement values will be added to each member's metrics report and to this section when both sheets are filled.</w:t>
+        <w:t xml:space="preserve"> sheet_rater2_Poushali.csv) and Poushali's built with task3_gan/Poushali_Purkayastha/src/audit.py from her generators.pt on the 30 photos her seed selects (sheet_Poushali.csv, sheet_Sadaf.csv).</w:t>
+      </w:r>
+    </w:p>
+    <w:p>
+      <w:r>
+        <w:t>Sadaf's model: mean style 3.40, content 3.10, artifacts 2.80 over 30 samples, rated so far by Sadaf only. In her own rating 12 of 30 samples scored 4 or 5 on style and 13 of 30 scored 2 or lower on artifacts, which agrees with the texture failures in section 5.4.</w:t>
+      </w:r>
+    </w:p>
+    <w:p>
+      <w:r>
+        <w:lastRenderedPageBreak/>
+        <w:t>Poushali's model: Sadaf rated the 30 blinded samples at style 4.07, content 3.63, artifacts 3.63 on the same scale, higher than her own model on all three criteria and in line with its better competition score; her sheet and the blinded set are to be pushed to task3_gan/Poushali_Purkayastha/outputs/full/audit, after which Poushali's ratings and Cohen's kappa are added here.</w:t>
       </w:r>
     </w:p>
     <w:p>
@@ -10930,7 +11332,6 @@
         <w:pStyle w:val="ListBullet"/>
       </w:pPr>
       <w:r>
-        <w:lastRenderedPageBreak/>
         <w:t>Zhang, R., Isola, P., Efros, A. A., Shechtman, E., Wang, O. (2018). The Unreasonable Effectiveness of Deep Features as a Perceptual Metric. CVPR.</w:t>
       </w:r>
     </w:p>
@@ -11125,31 +11526,31 @@
       </w:rPr>
     </w:lvl>
   </w:abstractNum>
-  <w:num w:numId="1" w16cid:durableId="1887375580">
+  <w:num w:numId="1" w16cid:durableId="674651780">
     <w:abstractNumId w:val="8"/>
   </w:num>
-  <w:num w:numId="2" w16cid:durableId="1496844250">
+  <w:num w:numId="2" w16cid:durableId="405347279">
     <w:abstractNumId w:val="6"/>
   </w:num>
-  <w:num w:numId="3" w16cid:durableId="671493255">
+  <w:num w:numId="3" w16cid:durableId="21593446">
     <w:abstractNumId w:val="5"/>
   </w:num>
-  <w:num w:numId="4" w16cid:durableId="1061945366">
+  <w:num w:numId="4" w16cid:durableId="216627491">
     <w:abstractNumId w:val="4"/>
   </w:num>
-  <w:num w:numId="5" w16cid:durableId="1041132293">
+  <w:num w:numId="5" w16cid:durableId="987321846">
     <w:abstractNumId w:val="7"/>
   </w:num>
-  <w:num w:numId="6" w16cid:durableId="1362903369">
+  <w:num w:numId="6" w16cid:durableId="524638914">
     <w:abstractNumId w:val="3"/>
   </w:num>
-  <w:num w:numId="7" w16cid:durableId="335962647">
+  <w:num w:numId="7" w16cid:durableId="222762154">
     <w:abstractNumId w:val="2"/>
   </w:num>
-  <w:num w:numId="8" w16cid:durableId="1150486844">
+  <w:num w:numId="8" w16cid:durableId="1771704410">
     <w:abstractNumId w:val="1"/>
   </w:num>
-  <w:num w:numId="9" w16cid:durableId="1763530139">
+  <w:num w:numId="9" w16cid:durableId="370034828">
     <w:abstractNumId w:val="0"/>
   </w:num>
 </w:numbering>

</xml_diff>

<commit_message>
Human audit: Poushali's ratings of Sadaf's set, one-rater results for Poushali's set, report rebuilt with agreement
</commit_message>
<xml_diff>
--- a/report/DATA266_Lab1_Report_Team_16.docx
+++ b/report/DATA266_Lab1_Report_Team_16.docx
@@ -1171,7 +1171,7 @@
           <w:noProof/>
         </w:rPr>
         <w:drawing>
-          <wp:inline distT="0" distB="0" distL="0" distR="0" wp14:anchorId="284F98A8" wp14:editId="10A03F53">
+          <wp:inline distT="0" distB="0" distL="0" distR="0" wp14:anchorId="3888F035" wp14:editId="787402E2">
             <wp:extent cx="5486400" cy="1828800"/>
             <wp:effectExtent l="0" t="0" r="0" b="0"/>
             <wp:docPr id="1" name="Picture 1"/>
@@ -1223,7 +1223,7 @@
         </w:rPr>
         <w:lastRenderedPageBreak/>
         <w:drawing>
-          <wp:inline distT="0" distB="0" distL="0" distR="0" wp14:anchorId="6EAA01E8" wp14:editId="0B180850">
+          <wp:inline distT="0" distB="0" distL="0" distR="0" wp14:anchorId="159F8BF2" wp14:editId="24C86F80">
             <wp:extent cx="5486400" cy="3712323"/>
             <wp:effectExtent l="0" t="0" r="0" b="0"/>
             <wp:docPr id="2" name="Picture 2"/>
@@ -5374,7 +5374,7 @@
         </w:rPr>
         <w:lastRenderedPageBreak/>
         <w:drawing>
-          <wp:inline distT="0" distB="0" distL="0" distR="0" wp14:anchorId="34038F40" wp14:editId="079B47D8">
+          <wp:inline distT="0" distB="0" distL="0" distR="0" wp14:anchorId="386A37E6" wp14:editId="5DEF4772">
             <wp:extent cx="2926080" cy="2600960"/>
             <wp:effectExtent l="0" t="0" r="0" b="0"/>
             <wp:docPr id="3" name="Picture 3"/>
@@ -5425,7 +5425,7 @@
           <w:noProof/>
         </w:rPr>
         <w:drawing>
-          <wp:inline distT="0" distB="0" distL="0" distR="0" wp14:anchorId="6B1FE8C8" wp14:editId="42322D27">
+          <wp:inline distT="0" distB="0" distL="0" distR="0" wp14:anchorId="3F94D8E6" wp14:editId="4C51CC64">
             <wp:extent cx="5486400" cy="1565618"/>
             <wp:effectExtent l="0" t="0" r="0" b="0"/>
             <wp:docPr id="4" name="Picture 4"/>
@@ -10181,7 +10181,7 @@
               <w:rPr>
                 <w:sz w:val="16"/>
               </w:rPr>
-              <w:t>pending: blinded set built with src/audit.py; sheets not yet in the repo</w:t>
+              <w:t>style 4.27, content 3.93, artifacts 3.67 (1 to 5, n = 30); one rater so far (Poushali)</w:t>
             </w:r>
           </w:p>
         </w:tc>
@@ -10194,7 +10194,7 @@
               <w:rPr>
                 <w:sz w:val="16"/>
               </w:rPr>
-              <w:t>style 3.40, content 3.10, artifacts 2.80 (1 to 5, n = 30); one rater so far (Sadaf)</w:t>
+              <w:t>style 3.38, content 3.15, artifacts 2.90 (1 to 5, n = 30); Cohen's kappa style 0.16, content 0.11, artifacts -0.12; both raters</w:t>
             </w:r>
           </w:p>
         </w:tc>
@@ -10248,7 +10248,7 @@
           <w:noProof/>
         </w:rPr>
         <w:drawing>
-          <wp:inline distT="0" distB="0" distL="0" distR="0" wp14:anchorId="19FB0B9C" wp14:editId="4EF91C5D">
+          <wp:inline distT="0" distB="0" distL="0" distR="0" wp14:anchorId="791AF430" wp14:editId="1A16C9CE">
             <wp:extent cx="5852160" cy="1376979"/>
             <wp:effectExtent l="0" t="0" r="0" b="0"/>
             <wp:docPr id="5" name="Picture 5"/>
@@ -10300,7 +10300,7 @@
         </w:rPr>
         <w:lastRenderedPageBreak/>
         <w:drawing>
-          <wp:inline distT="0" distB="0" distL="0" distR="0" wp14:anchorId="45C1FA92" wp14:editId="3DB68443">
+          <wp:inline distT="0" distB="0" distL="0" distR="0" wp14:anchorId="77489AC1" wp14:editId="3765E3C9">
             <wp:extent cx="3108960" cy="4663440"/>
             <wp:effectExtent l="0" t="0" r="0" b="0"/>
             <wp:docPr id="6" name="Picture 6"/>
@@ -10351,7 +10351,7 @@
           <w:noProof/>
         </w:rPr>
         <w:drawing>
-          <wp:inline distT="0" distB="0" distL="0" distR="0" wp14:anchorId="1DFCD449" wp14:editId="0768B51D">
+          <wp:inline distT="0" distB="0" distL="0" distR="0" wp14:anchorId="5AE071A8" wp14:editId="6F75197D">
             <wp:extent cx="5486400" cy="2562056"/>
             <wp:effectExtent l="0" t="0" r="0" b="0"/>
             <wp:docPr id="7" name="Picture 7"/>
@@ -10403,7 +10403,7 @@
         </w:rPr>
         <w:lastRenderedPageBreak/>
         <w:drawing>
-          <wp:inline distT="0" distB="0" distL="0" distR="0" wp14:anchorId="56F8BCAD" wp14:editId="1F6B19F5">
+          <wp:inline distT="0" distB="0" distL="0" distR="0" wp14:anchorId="7A5FB9FB" wp14:editId="456ECFD7">
             <wp:extent cx="4572000" cy="2288213"/>
             <wp:effectExtent l="0" t="0" r="0" b="0"/>
             <wp:docPr id="8" name="Picture 8"/>
@@ -10763,7 +10763,7 @@
           <w:noProof/>
         </w:rPr>
         <w:drawing>
-          <wp:inline distT="0" distB="0" distL="0" distR="0" wp14:anchorId="6ACF8F10" wp14:editId="37B04875">
+          <wp:inline distT="0" distB="0" distL="0" distR="0" wp14:anchorId="4728361C" wp14:editId="6CB0A331">
             <wp:extent cx="2194560" cy="2194560"/>
             <wp:effectExtent l="0" t="0" r="0" b="0"/>
             <wp:docPr id="9" name="Picture 9"/>
@@ -10815,7 +10815,7 @@
         </w:rPr>
         <w:lastRenderedPageBreak/>
         <w:drawing>
-          <wp:inline distT="0" distB="0" distL="0" distR="0" wp14:anchorId="00D87CDC" wp14:editId="0C3ABAEC">
+          <wp:inline distT="0" distB="0" distL="0" distR="0" wp14:anchorId="4F717288" wp14:editId="4E439C41">
             <wp:extent cx="2194560" cy="2194560"/>
             <wp:effectExtent l="0" t="0" r="0" b="0"/>
             <wp:docPr id="10" name="Picture 10"/>
@@ -11230,13 +11230,12 @@
     </w:p>
     <w:p>
       <w:r>
-        <w:t>Sadaf's model: mean style 3.40, content 3.10, artifacts 2.80 over 30 samples, rated so far by Sadaf only. In her own rating 12 of 30 samples scored 4 or 5 on style and 13 of 30 scored 2 or lower on artifacts, which agrees with the texture failures in section 5.4.</w:t>
+        <w:t>Sadaf's model: mean style 3.38, content 3.15, artifacts 2.90 over 30 samples, rated by both members; Cohen's kappa style 0.16, content 0.11, artifacts -0.12; exact agreement 47%, 33%, 20%.</w:t>
       </w:r>
     </w:p>
     <w:p>
       <w:r>
-        <w:lastRenderedPageBreak/>
-        <w:t>Poushali's model: Sadaf rated the 30 blinded samples at style 4.07, content 3.63, artifacts 3.63 on the same scale, higher than her own model on all three criteria and in line with its better competition score; her sheet and the blinded set are to be pushed to task3_gan/Poushali_Purkayastha/outputs/full/audit, after which Poushali's ratings and Cohen's kappa are added here.</w:t>
+        <w:t>Poushali's model: mean style 4.27, content 3.93, artifacts 3.67 over 30 samples, rated so far by Poushali only.</w:t>
       </w:r>
     </w:p>
     <w:p>
@@ -11244,6 +11243,7 @@
         <w:pStyle w:val="Heading1"/>
       </w:pPr>
       <w:r>
+        <w:lastRenderedPageBreak/>
         <w:t>6. References</w:t>
       </w:r>
     </w:p>
@@ -11526,31 +11526,31 @@
       </w:rPr>
     </w:lvl>
   </w:abstractNum>
-  <w:num w:numId="1" w16cid:durableId="674651780">
+  <w:num w:numId="1" w16cid:durableId="999190732">
     <w:abstractNumId w:val="8"/>
   </w:num>
-  <w:num w:numId="2" w16cid:durableId="405347279">
+  <w:num w:numId="2" w16cid:durableId="469905129">
     <w:abstractNumId w:val="6"/>
   </w:num>
-  <w:num w:numId="3" w16cid:durableId="21593446">
+  <w:num w:numId="3" w16cid:durableId="753941871">
     <w:abstractNumId w:val="5"/>
   </w:num>
-  <w:num w:numId="4" w16cid:durableId="216627491">
+  <w:num w:numId="4" w16cid:durableId="1648318131">
     <w:abstractNumId w:val="4"/>
   </w:num>
-  <w:num w:numId="5" w16cid:durableId="987321846">
+  <w:num w:numId="5" w16cid:durableId="64845135">
     <w:abstractNumId w:val="7"/>
   </w:num>
-  <w:num w:numId="6" w16cid:durableId="524638914">
+  <w:num w:numId="6" w16cid:durableId="603539951">
     <w:abstractNumId w:val="3"/>
   </w:num>
-  <w:num w:numId="7" w16cid:durableId="222762154">
+  <w:num w:numId="7" w16cid:durableId="688143735">
     <w:abstractNumId w:val="2"/>
   </w:num>
-  <w:num w:numId="8" w16cid:durableId="1771704410">
+  <w:num w:numId="8" w16cid:durableId="1400984286">
     <w:abstractNumId w:val="1"/>
   </w:num>
-  <w:num w:numId="9" w16cid:durableId="370034828">
+  <w:num w:numId="9" w16cid:durableId="1606838426">
     <w:abstractNumId w:val="0"/>
   </w:num>
 </w:numbering>

</xml_diff>

<commit_message>
Human audit complete for Poushali's model: two-rater kappa in metrics, results.md, and report
</commit_message>
<xml_diff>
--- a/report/DATA266_Lab1_Report_Team_16.docx
+++ b/report/DATA266_Lab1_Report_Team_16.docx
@@ -1171,7 +1171,7 @@
           <w:noProof/>
         </w:rPr>
         <w:drawing>
-          <wp:inline distT="0" distB="0" distL="0" distR="0" wp14:anchorId="3888F035" wp14:editId="787402E2">
+          <wp:inline distT="0" distB="0" distL="0" distR="0" wp14:anchorId="3821B654" wp14:editId="005C8EA9">
             <wp:extent cx="5486400" cy="1828800"/>
             <wp:effectExtent l="0" t="0" r="0" b="0"/>
             <wp:docPr id="1" name="Picture 1"/>
@@ -1223,7 +1223,7 @@
         </w:rPr>
         <w:lastRenderedPageBreak/>
         <w:drawing>
-          <wp:inline distT="0" distB="0" distL="0" distR="0" wp14:anchorId="159F8BF2" wp14:editId="24C86F80">
+          <wp:inline distT="0" distB="0" distL="0" distR="0" wp14:anchorId="79D98A36" wp14:editId="299828E4">
             <wp:extent cx="5486400" cy="3712323"/>
             <wp:effectExtent l="0" t="0" r="0" b="0"/>
             <wp:docPr id="2" name="Picture 2"/>
@@ -5374,7 +5374,7 @@
         </w:rPr>
         <w:lastRenderedPageBreak/>
         <w:drawing>
-          <wp:inline distT="0" distB="0" distL="0" distR="0" wp14:anchorId="386A37E6" wp14:editId="5DEF4772">
+          <wp:inline distT="0" distB="0" distL="0" distR="0" wp14:anchorId="4D656AA6" wp14:editId="46B94882">
             <wp:extent cx="2926080" cy="2600960"/>
             <wp:effectExtent l="0" t="0" r="0" b="0"/>
             <wp:docPr id="3" name="Picture 3"/>
@@ -5425,7 +5425,7 @@
           <w:noProof/>
         </w:rPr>
         <w:drawing>
-          <wp:inline distT="0" distB="0" distL="0" distR="0" wp14:anchorId="3F94D8E6" wp14:editId="4C51CC64">
+          <wp:inline distT="0" distB="0" distL="0" distR="0" wp14:anchorId="4D1F73C6" wp14:editId="4AA956E2">
             <wp:extent cx="5486400" cy="1565618"/>
             <wp:effectExtent l="0" t="0" r="0" b="0"/>
             <wp:docPr id="4" name="Picture 4"/>
@@ -10181,7 +10181,7 @@
               <w:rPr>
                 <w:sz w:val="16"/>
               </w:rPr>
-              <w:t>style 4.27, content 3.93, artifacts 3.67 (1 to 5, n = 30); one rater so far (Poushali)</w:t>
+              <w:t>style 4.17, content 3.78, artifacts 3.65 (1 to 5, n = 30); Cohen's kappa style 0.27, content 0.17, artifacts 0.20; both raters</w:t>
             </w:r>
           </w:p>
         </w:tc>
@@ -10248,7 +10248,7 @@
           <w:noProof/>
         </w:rPr>
         <w:drawing>
-          <wp:inline distT="0" distB="0" distL="0" distR="0" wp14:anchorId="791AF430" wp14:editId="1A16C9CE">
+          <wp:inline distT="0" distB="0" distL="0" distR="0" wp14:anchorId="5D7701C7" wp14:editId="398C1BCA">
             <wp:extent cx="5852160" cy="1376979"/>
             <wp:effectExtent l="0" t="0" r="0" b="0"/>
             <wp:docPr id="5" name="Picture 5"/>
@@ -10300,7 +10300,7 @@
         </w:rPr>
         <w:lastRenderedPageBreak/>
         <w:drawing>
-          <wp:inline distT="0" distB="0" distL="0" distR="0" wp14:anchorId="77489AC1" wp14:editId="3765E3C9">
+          <wp:inline distT="0" distB="0" distL="0" distR="0" wp14:anchorId="4F12EED2" wp14:editId="2460D159">
             <wp:extent cx="3108960" cy="4663440"/>
             <wp:effectExtent l="0" t="0" r="0" b="0"/>
             <wp:docPr id="6" name="Picture 6"/>
@@ -10351,7 +10351,7 @@
           <w:noProof/>
         </w:rPr>
         <w:drawing>
-          <wp:inline distT="0" distB="0" distL="0" distR="0" wp14:anchorId="5AE071A8" wp14:editId="6F75197D">
+          <wp:inline distT="0" distB="0" distL="0" distR="0" wp14:anchorId="314BFBC1" wp14:editId="4B05EC56">
             <wp:extent cx="5486400" cy="2562056"/>
             <wp:effectExtent l="0" t="0" r="0" b="0"/>
             <wp:docPr id="7" name="Picture 7"/>
@@ -10403,7 +10403,7 @@
         </w:rPr>
         <w:lastRenderedPageBreak/>
         <w:drawing>
-          <wp:inline distT="0" distB="0" distL="0" distR="0" wp14:anchorId="7A5FB9FB" wp14:editId="456ECFD7">
+          <wp:inline distT="0" distB="0" distL="0" distR="0" wp14:anchorId="3D48752F" wp14:editId="1FC47307">
             <wp:extent cx="4572000" cy="2288213"/>
             <wp:effectExtent l="0" t="0" r="0" b="0"/>
             <wp:docPr id="8" name="Picture 8"/>
@@ -10763,7 +10763,7 @@
           <w:noProof/>
         </w:rPr>
         <w:drawing>
-          <wp:inline distT="0" distB="0" distL="0" distR="0" wp14:anchorId="4728361C" wp14:editId="6CB0A331">
+          <wp:inline distT="0" distB="0" distL="0" distR="0" wp14:anchorId="4E7D9D0C" wp14:editId="43FEB677">
             <wp:extent cx="2194560" cy="2194560"/>
             <wp:effectExtent l="0" t="0" r="0" b="0"/>
             <wp:docPr id="9" name="Picture 9"/>
@@ -10815,7 +10815,7 @@
         </w:rPr>
         <w:lastRenderedPageBreak/>
         <w:drawing>
-          <wp:inline distT="0" distB="0" distL="0" distR="0" wp14:anchorId="4F717288" wp14:editId="4E439C41">
+          <wp:inline distT="0" distB="0" distL="0" distR="0" wp14:anchorId="1DAADCA8" wp14:editId="3EDFE250">
             <wp:extent cx="2194560" cy="2194560"/>
             <wp:effectExtent l="0" t="0" r="0" b="0"/>
             <wp:docPr id="10" name="Picture 10"/>
@@ -11235,7 +11235,8 @@
     </w:p>
     <w:p>
       <w:r>
-        <w:t>Poushali's model: mean style 4.27, content 3.93, artifacts 3.67 over 30 samples, rated so far by Poushali only.</w:t>
+        <w:lastRenderedPageBreak/>
+        <w:t>Poushali's model: mean style 4.17, content 3.78, artifacts 3.65 over 30 samples, rated by both members; Cohen's kappa style 0.27, content 0.17, artifacts 0.20; exact agreement 53%, 43%, 43%.</w:t>
       </w:r>
     </w:p>
     <w:p>
@@ -11243,7 +11244,6 @@
         <w:pStyle w:val="Heading1"/>
       </w:pPr>
       <w:r>
-        <w:lastRenderedPageBreak/>
         <w:t>6. References</w:t>
       </w:r>
     </w:p>
@@ -11526,31 +11526,31 @@
       </w:rPr>
     </w:lvl>
   </w:abstractNum>
-  <w:num w:numId="1" w16cid:durableId="999190732">
+  <w:num w:numId="1" w16cid:durableId="1073233575">
     <w:abstractNumId w:val="8"/>
   </w:num>
-  <w:num w:numId="2" w16cid:durableId="469905129">
+  <w:num w:numId="2" w16cid:durableId="937130520">
     <w:abstractNumId w:val="6"/>
   </w:num>
-  <w:num w:numId="3" w16cid:durableId="753941871">
+  <w:num w:numId="3" w16cid:durableId="241182094">
     <w:abstractNumId w:val="5"/>
   </w:num>
-  <w:num w:numId="4" w16cid:durableId="1648318131">
+  <w:num w:numId="4" w16cid:durableId="1813523438">
     <w:abstractNumId w:val="4"/>
   </w:num>
-  <w:num w:numId="5" w16cid:durableId="64845135">
+  <w:num w:numId="5" w16cid:durableId="61569305">
     <w:abstractNumId w:val="7"/>
   </w:num>
-  <w:num w:numId="6" w16cid:durableId="603539951">
+  <w:num w:numId="6" w16cid:durableId="611742397">
     <w:abstractNumId w:val="3"/>
   </w:num>
-  <w:num w:numId="7" w16cid:durableId="688143735">
+  <w:num w:numId="7" w16cid:durableId="1289165645">
     <w:abstractNumId w:val="2"/>
   </w:num>
-  <w:num w:numId="8" w16cid:durableId="1400984286">
+  <w:num w:numId="8" w16cid:durableId="1132019209">
     <w:abstractNumId w:val="1"/>
   </w:num>
-  <w:num w:numId="9" w16cid:durableId="1606838426">
+  <w:num w:numId="9" w16cid:durableId="812868535">
     <w:abstractNumId w:val="0"/>
   </w:num>
 </w:numbering>

</xml_diff>